<commit_message>
FEAT: Documents and Project Folder
</commit_message>
<xml_diff>
--- a/Documents/JAVA ASSIGNMENT-VISHRUTHAA V R 25ITR177.docx
+++ b/Documents/JAVA ASSIGNMENT-VISHRUTHAA V R 25ITR177.docx
@@ -12635,7 +12635,23 @@
           <w:szCs w:val="24"/>
           <w:lang w:val="en-IN"/>
         </w:rPr>
-        <w:t>    private static final String passwd = "vr@2007";</w:t>
+        <w:t>    private static final String passwd = "</w:t>
+      </w:r>
+      <w:r>
+        <w:rPr>
+          <w:sz w:val="24"/>
+          <w:szCs w:val="24"/>
+          <w:lang w:val="en-IN"/>
+        </w:rPr>
+        <w:t>****</w:t>
+      </w:r>
+      <w:r>
+        <w:rPr>
+          <w:sz w:val="24"/>
+          <w:szCs w:val="24"/>
+          <w:lang w:val="en-IN"/>
+        </w:rPr>
+        <w:t>";</w:t>
       </w:r>
     </w:p>
     <w:p>

</xml_diff>